<commit_message>
Rechtschreibung und kleine Sachen
</commit_message>
<xml_diff>
--- a/Documentation/Dokumentation.docx
+++ b/Documentation/Dokumentation.docx
@@ -1,6 +1,6 @@
 
 <file path=word/document.xml><?xml version="1.0" encoding="utf-8"?>
-<w:document xmlns:wpc="http://schemas.microsoft.com/office/word/2010/wordprocessingCanvas" xmlns:cx="http://schemas.microsoft.com/office/drawing/2014/chartex" xmlns:cx1="http://schemas.microsoft.com/office/drawing/2015/9/8/chartex" xmlns:cx2="http://schemas.microsoft.com/office/drawing/2015/10/21/chartex" xmlns:cx3="http://schemas.microsoft.com/office/drawing/2016/5/9/chartex" xmlns:cx4="http://schemas.microsoft.com/office/drawing/2016/5/10/chartex" xmlns:cx5="http://schemas.microsoft.com/office/drawing/2016/5/11/chartex" xmlns:cx6="http://schemas.microsoft.com/office/drawing/2016/5/12/chartex" xmlns:cx7="http://schemas.microsoft.com/office/drawing/2016/5/13/chartex" xmlns:cx8="http://schemas.microsoft.com/office/drawing/2016/5/14/chartex" xmlns:mc="http://schemas.openxmlformats.org/markup-compatibility/2006" xmlns:aink="http://schemas.microsoft.com/office/drawing/2016/ink" xmlns:am3d="http://schemas.microsoft.com/office/drawing/2017/model3d" xmlns:o="urn:schemas-microsoft-com:office:office" xmlns:oel="http://schemas.microsoft.com/office/2019/extlst" xmlns:r="http://schemas.openxmlformats.org/officeDocument/2006/relationships" xmlns:m="http://schemas.openxmlformats.org/officeDocument/2006/math" xmlns:v="urn:schemas-microsoft-com:vml" xmlns:wp14="http://schemas.microsoft.com/office/word/2010/wordprocessingDrawing" xmlns:wp="http://schemas.openxmlformats.org/drawingml/2006/wordprocessingDrawing" xmlns:w10="urn:schemas-microsoft-com:office:word" xmlns:w="http://schemas.openxmlformats.org/wordprocessingml/2006/main" xmlns:w14="http://schemas.microsoft.com/office/word/2010/wordml" xmlns:w15="http://schemas.microsoft.com/office/word/2012/wordml" xmlns:w16cex="http://schemas.microsoft.com/office/word/2018/wordml/cex" xmlns:w16cid="http://schemas.microsoft.com/office/word/2016/wordml/cid" xmlns:w16="http://schemas.microsoft.com/office/word/2018/wordml" xmlns:w16du="http://schemas.microsoft.com/office/word/2023/wordml/word16du" xmlns:w16sdtdh="http://schemas.microsoft.com/office/word/2020/wordml/sdtdatahash" xmlns:w16se="http://schemas.microsoft.com/office/word/2015/wordml/symex" xmlns:wpg="http://schemas.microsoft.com/office/word/2010/wordprocessingGroup" xmlns:wpi="http://schemas.microsoft.com/office/word/2010/wordprocessingInk" xmlns:wne="http://schemas.microsoft.com/office/word/2006/wordml" xmlns:wps="http://schemas.microsoft.com/office/word/2010/wordprocessingShape" mc:Ignorable="w14 w15 w16se w16cid w16 w16cex w16sdtdh wp14">
+<w:document xmlns:wpc="http://schemas.microsoft.com/office/word/2010/wordprocessingCanvas" xmlns:cx="http://schemas.microsoft.com/office/drawing/2014/chartex" xmlns:cx1="http://schemas.microsoft.com/office/drawing/2015/9/8/chartex" xmlns:cx2="http://schemas.microsoft.com/office/drawing/2015/10/21/chartex" xmlns:cx3="http://schemas.microsoft.com/office/drawing/2016/5/9/chartex" xmlns:cx4="http://schemas.microsoft.com/office/drawing/2016/5/10/chartex" xmlns:cx5="http://schemas.microsoft.com/office/drawing/2016/5/11/chartex" xmlns:cx6="http://schemas.microsoft.com/office/drawing/2016/5/12/chartex" xmlns:cx7="http://schemas.microsoft.com/office/drawing/2016/5/13/chartex" xmlns:cx8="http://schemas.microsoft.com/office/drawing/2016/5/14/chartex" xmlns:mc="http://schemas.openxmlformats.org/markup-compatibility/2006" xmlns:aink="http://schemas.microsoft.com/office/drawing/2016/ink" xmlns:am3d="http://schemas.microsoft.com/office/drawing/2017/model3d" xmlns:o="urn:schemas-microsoft-com:office:office" xmlns:oel="http://schemas.microsoft.com/office/2019/extlst" xmlns:r="http://schemas.openxmlformats.org/officeDocument/2006/relationships" xmlns:m="http://schemas.openxmlformats.org/officeDocument/2006/math" xmlns:v="urn:schemas-microsoft-com:vml" xmlns:wp14="http://schemas.microsoft.com/office/word/2010/wordprocessingDrawing" xmlns:wp="http://schemas.openxmlformats.org/drawingml/2006/wordprocessingDrawing" xmlns:w10="urn:schemas-microsoft-com:office:word" xmlns:w="http://schemas.openxmlformats.org/wordprocessingml/2006/main" xmlns:w14="http://schemas.microsoft.com/office/word/2010/wordml" xmlns:w15="http://schemas.microsoft.com/office/word/2012/wordml" xmlns:w16cex="http://schemas.microsoft.com/office/word/2018/wordml/cex" xmlns:w16cid="http://schemas.microsoft.com/office/word/2016/wordml/cid" xmlns:w16="http://schemas.microsoft.com/office/word/2018/wordml" xmlns:w16sdtdh="http://schemas.microsoft.com/office/word/2020/wordml/sdtdatahash" xmlns:w16se="http://schemas.microsoft.com/office/word/2015/wordml/symex" xmlns:wpg="http://schemas.microsoft.com/office/word/2010/wordprocessingGroup" xmlns:wpi="http://schemas.microsoft.com/office/word/2010/wordprocessingInk" xmlns:wne="http://schemas.microsoft.com/office/word/2006/wordml" xmlns:wps="http://schemas.microsoft.com/office/word/2010/wordprocessingShape" mc:Ignorable="w14 w15 w16se w16cid w16 w16cex w16sdtdh wp14">
   <w:body>
     <w:p/>
     <w:p>
@@ -186,7 +186,6 @@
           <w:szCs w:val="40"/>
         </w:rPr>
       </w:pPr>
-      <w:proofErr w:type="spellStart"/>
       <w:r>
         <w:rPr>
           <w:color w:val="A6A6A6" w:themeColor="background1" w:themeShade="A6"/>
@@ -195,7 +194,6 @@
         </w:rPr>
         <w:t>Hyperformer_ContactSplitter</w:t>
       </w:r>
-      <w:proofErr w:type="spellEnd"/>
     </w:p>
     <w:p>
       <w:pPr>
@@ -288,11 +286,9 @@
           <w:color w:val="A6A6A6" w:themeColor="background1" w:themeShade="A6"/>
           <w:sz w:val="40"/>
           <w:szCs w:val="40"/>
-          <w:lang w:val="en-US"/>
-        </w:rPr>
-        <w:t xml:space="preserve">Dipl.-Math. Christian </w:t>
-      </w:r>
-      <w:proofErr w:type="spellStart"/>
+        </w:rPr>
+        <w:t xml:space="preserve">Dipl.-Math. </w:t>
+      </w:r>
       <w:r>
         <w:rPr>
           <w:color w:val="A6A6A6" w:themeColor="background1" w:themeShade="A6"/>
@@ -300,9 +296,8 @@
           <w:szCs w:val="40"/>
           <w:lang w:val="en-US"/>
         </w:rPr>
-        <w:t>Hübscher</w:t>
-      </w:r>
-      <w:proofErr w:type="spellEnd"/>
+        <w:t>Christian Hübscher</w:t>
+      </w:r>
     </w:p>
     <w:p>
       <w:pPr>
@@ -1105,7 +1100,7 @@
             <w:noProof/>
             <w:webHidden/>
           </w:rPr>
-          <w:t>6</w:t>
+          <w:t>9</w:t>
         </w:r>
         <w:r>
           <w:rPr>
@@ -1174,7 +1169,7 @@
             <w:noProof/>
             <w:webHidden/>
           </w:rPr>
-          <w:t>7</w:t>
+          <w:t>10</w:t>
         </w:r>
         <w:r>
           <w:rPr>
@@ -1243,7 +1238,7 @@
             <w:noProof/>
             <w:webHidden/>
           </w:rPr>
-          <w:t>8</w:t>
+          <w:t>11</w:t>
         </w:r>
         <w:r>
           <w:rPr>
@@ -1276,13 +1271,11 @@
         <w:spacing w:line="360" w:lineRule="auto"/>
       </w:pPr>
       <w:bookmarkStart w:id="0" w:name="_Toc134474881"/>
-      <w:proofErr w:type="spellStart"/>
       <w:r>
         <w:lastRenderedPageBreak/>
         <w:t>Hyperformer_ContactSplitter</w:t>
       </w:r>
       <w:bookmarkEnd w:id="0"/>
-      <w:proofErr w:type="spellEnd"/>
     </w:p>
     <w:p>
       <w:pPr>
@@ -1323,15 +1316,7 @@
       </w:pPr>
       <w:bookmarkStart w:id="2" w:name="_Toc134474883"/>
       <w:r>
-        <w:t xml:space="preserve">Composite Components und </w:t>
-      </w:r>
-      <w:proofErr w:type="spellStart"/>
-      <w:r>
-        <w:t>Dependency</w:t>
-      </w:r>
-      <w:proofErr w:type="spellEnd"/>
-      <w:r>
-        <w:t xml:space="preserve"> Inversion</w:t>
+        <w:t>Composite Components und Dependency Inversion</w:t>
       </w:r>
       <w:bookmarkEnd w:id="2"/>
     </w:p>
@@ -1357,32 +1342,17 @@
       <w:r>
         <w:t xml:space="preserve">immer aus zwei </w:t>
       </w:r>
-      <w:proofErr w:type="spellStart"/>
       <w:r>
         <w:t>Assemblies</w:t>
       </w:r>
-      <w:proofErr w:type="spellEnd"/>
-      <w:r>
-        <w:t>: Ein Assembly enthält die Implementierungen, das andere die Schnittstellen und Datenklassen (</w:t>
-      </w:r>
-      <w:proofErr w:type="spellStart"/>
-      <w:r>
-        <w:t>Contract</w:t>
-      </w:r>
-      <w:proofErr w:type="spellEnd"/>
-      <w:r>
-        <w:t>)</w:t>
+      <w:r>
+        <w:t>: Ein Assembly enthält die Implementierungen, das andere die Schnittstellen und Datenklassen (Contract)</w:t>
       </w:r>
       <w:r>
         <w:t xml:space="preserve">. </w:t>
       </w:r>
-      <w:proofErr w:type="spellStart"/>
-      <w:r>
-        <w:t>Assemblies</w:t>
-      </w:r>
-      <w:proofErr w:type="spellEnd"/>
-      <w:r>
-        <w:t xml:space="preserve"> </w:t>
+      <w:r>
+        <w:t xml:space="preserve">Assemblies </w:t>
       </w:r>
       <w:r>
         <w:t>besitzen</w:t>
@@ -1391,26 +1361,10 @@
         <w:t xml:space="preserve"> dabei immer nur Abhängigkeiten</w:t>
       </w:r>
       <w:r>
-        <w:t xml:space="preserve"> zu einer </w:t>
-      </w:r>
-      <w:proofErr w:type="spellStart"/>
-      <w:r>
-        <w:t>Contract</w:t>
-      </w:r>
-      <w:proofErr w:type="spellEnd"/>
-      <w:r>
-        <w:t xml:space="preserve"> Assembly</w:t>
-      </w:r>
-      <w:r>
-        <w:t xml:space="preserve"> (</w:t>
-      </w:r>
-      <w:proofErr w:type="spellStart"/>
-      <w:r>
-        <w:t>Dependency</w:t>
-      </w:r>
-      <w:proofErr w:type="spellEnd"/>
-      <w:r>
-        <w:t xml:space="preserve"> Inversion)</w:t>
+        <w:t xml:space="preserve"> zu einer Contract Assembly</w:t>
+      </w:r>
+      <w:r>
+        <w:t xml:space="preserve"> (Dependency Inversion)</w:t>
       </w:r>
       <w:r>
         <w:t>.</w:t>
@@ -1466,20 +1420,10 @@
         <w:spacing w:line="360" w:lineRule="auto"/>
       </w:pPr>
       <w:bookmarkStart w:id="3" w:name="_Toc134474884"/>
-      <w:proofErr w:type="spellStart"/>
-      <w:r>
-        <w:t>Dependency</w:t>
-      </w:r>
-      <w:proofErr w:type="spellEnd"/>
-      <w:r>
-        <w:t xml:space="preserve"> </w:t>
-      </w:r>
-      <w:proofErr w:type="spellStart"/>
-      <w:r>
-        <w:t>Injection</w:t>
+      <w:r>
+        <w:t>Dependency Injection</w:t>
       </w:r>
       <w:bookmarkEnd w:id="3"/>
-      <w:proofErr w:type="spellEnd"/>
       <w:r>
         <w:t xml:space="preserve"> </w:t>
       </w:r>
@@ -1492,43 +1436,17 @@
       <w:r>
         <w:t xml:space="preserve">Das Mapping von </w:t>
       </w:r>
-      <w:proofErr w:type="spellStart"/>
       <w:r>
         <w:t>Contracts</w:t>
       </w:r>
-      <w:proofErr w:type="spellEnd"/>
-      <w:r>
-        <w:t xml:space="preserve"> und Implementierungen erfolgt über einen </w:t>
-      </w:r>
-      <w:proofErr w:type="spellStart"/>
-      <w:r>
-        <w:t>Dependecy</w:t>
-      </w:r>
-      <w:proofErr w:type="spellEnd"/>
-      <w:r>
-        <w:t xml:space="preserve"> </w:t>
-      </w:r>
-      <w:proofErr w:type="spellStart"/>
-      <w:r>
-        <w:t>Injection</w:t>
-      </w:r>
-      <w:proofErr w:type="spellEnd"/>
-      <w:r>
-        <w:t xml:space="preserve"> Container, </w:t>
+      <w:r>
+        <w:t xml:space="preserve"> und Implementierungen erfolgt über einen Dependecy Injection Container, </w:t>
       </w:r>
       <w:r>
         <w:t>dessen Konfiguration</w:t>
       </w:r>
       <w:r>
-        <w:t xml:space="preserve"> sich im Hauptprojekt (</w:t>
-      </w:r>
-      <w:proofErr w:type="spellStart"/>
-      <w:r>
-        <w:t>ContactSplitter</w:t>
-      </w:r>
-      <w:proofErr w:type="spellEnd"/>
-      <w:r>
-        <w:t>) befindet. Das Hauptprojekt konsumiert alle Komponenten und führt entsprechende Kompositionen durch.</w:t>
+        <w:t xml:space="preserve"> sich im Hauptprojekt (ContactSplitter) befindet. Das Hauptprojekt konsumiert alle Komponenten und führt entsprechende Kompositionen durch.</w:t>
       </w:r>
       <w:r>
         <w:t xml:space="preserve"> </w:t>
@@ -1599,59 +1517,28 @@
         <w:t>UI, Logik und Repository</w:t>
       </w:r>
       <w:r>
-        <w:t xml:space="preserve">, welche sich in den </w:t>
-      </w:r>
-      <w:proofErr w:type="spellStart"/>
-      <w:r>
-        <w:t>Assemblies</w:t>
-      </w:r>
-      <w:proofErr w:type="spellEnd"/>
+        <w:t>, welche sich in den Assemblies</w:t>
+      </w:r>
       <w:r>
         <w:t>:</w:t>
       </w:r>
       <w:r>
-        <w:t xml:space="preserve"> </w:t>
-      </w:r>
-      <w:proofErr w:type="spellStart"/>
-      <w:r>
-        <w:t>ContactSplitter</w:t>
-      </w:r>
-      <w:r>
-        <w:t>.Control</w:t>
-      </w:r>
-      <w:proofErr w:type="spellEnd"/>
-      <w:r>
-        <w:t xml:space="preserve"> </w:t>
+        <w:t xml:space="preserve"> ContactSplitter</w:t>
+      </w:r>
+      <w:r>
+        <w:t xml:space="preserve">.Control </w:t>
       </w:r>
       <w:r>
         <w:t xml:space="preserve">(UI), </w:t>
       </w:r>
-      <w:proofErr w:type="spellStart"/>
-      <w:r>
-        <w:t>ContactParser.Contracts</w:t>
-      </w:r>
-      <w:proofErr w:type="spellEnd"/>
-      <w:r>
-        <w:t xml:space="preserve"> und </w:t>
-      </w:r>
-      <w:proofErr w:type="spellStart"/>
-      <w:r>
-        <w:t>ContractParser</w:t>
-      </w:r>
-      <w:proofErr w:type="spellEnd"/>
-      <w:r>
-        <w:t xml:space="preserve"> (Logik) </w:t>
+      <w:r>
+        <w:t xml:space="preserve">ContactParser.Contracts und ContractParser (Logik) </w:t>
       </w:r>
       <w:r>
         <w:t xml:space="preserve">und </w:t>
       </w:r>
-      <w:proofErr w:type="spellStart"/>
-      <w:r>
-        <w:t>ContactSplitter.Datastorage</w:t>
-      </w:r>
-      <w:proofErr w:type="spellEnd"/>
-      <w:r>
-        <w:t xml:space="preserve"> (Repository) manifestieren. </w:t>
+      <w:r>
+        <w:t xml:space="preserve">ContactSplitter.Datastorage (Repository) manifestieren. </w:t>
       </w:r>
     </w:p>
     <w:p>
@@ -1671,15 +1558,7 @@
         <w:jc w:val="both"/>
       </w:pPr>
       <w:r>
-        <w:t>Die Model-View-</w:t>
-      </w:r>
-      <w:proofErr w:type="spellStart"/>
-      <w:r>
-        <w:t>ViewModel</w:t>
-      </w:r>
-      <w:proofErr w:type="spellEnd"/>
-      <w:r>
-        <w:t xml:space="preserve"> bezieht sich auf das Zusammenspiel von UI</w:t>
+        <w:t>Die Model-View-ViewModel bezieht sich auf das Zusammenspiel von UI</w:t>
       </w:r>
       <w:r>
         <w:t xml:space="preserve">, </w:t>
@@ -1700,15 +1579,7 @@
         <w:t xml:space="preserve">. </w:t>
       </w:r>
       <w:r>
-        <w:t xml:space="preserve">Durch Bindung an ein </w:t>
-      </w:r>
-      <w:proofErr w:type="spellStart"/>
-      <w:r>
-        <w:t>ViewModel</w:t>
-      </w:r>
-      <w:proofErr w:type="spellEnd"/>
-      <w:r>
-        <w:t xml:space="preserve"> findet die Entkopplung von UI</w:t>
+        <w:t>Durch Bindung an ein ViewModel findet die Entkopplung von UI</w:t>
       </w:r>
       <w:r>
         <w:t xml:space="preserve">-Design </w:t>
@@ -1723,21 +1594,13 @@
         <w:t xml:space="preserve"> statt</w:t>
       </w:r>
       <w:r>
-        <w:t xml:space="preserve">. Somit kann das </w:t>
-      </w:r>
-      <w:proofErr w:type="spellStart"/>
-      <w:r>
-        <w:t>View</w:t>
+        <w:t>. Somit kann das View</w:t>
       </w:r>
       <w:r>
         <w:t>M</w:t>
       </w:r>
       <w:r>
-        <w:t>odel</w:t>
-      </w:r>
-      <w:proofErr w:type="spellEnd"/>
-      <w:r>
-        <w:t xml:space="preserve"> leicht ausgetauscht werden. </w:t>
+        <w:t xml:space="preserve">odel leicht ausgetauscht werden. </w:t>
       </w:r>
       <w:r>
         <w:t xml:space="preserve"> </w:t>
@@ -1749,12 +1612,10 @@
         <w:spacing w:line="360" w:lineRule="auto"/>
       </w:pPr>
       <w:bookmarkStart w:id="6" w:name="_Toc134474887"/>
-      <w:proofErr w:type="spellStart"/>
       <w:r>
         <w:t>CleanCode</w:t>
       </w:r>
       <w:bookmarkEnd w:id="6"/>
-      <w:proofErr w:type="spellEnd"/>
     </w:p>
     <w:p>
       <w:pPr>
@@ -1772,34 +1633,16 @@
         <w:t>Einhaltung</w:t>
       </w:r>
       <w:r>
-        <w:t xml:space="preserve"> von </w:t>
-      </w:r>
-      <w:proofErr w:type="spellStart"/>
-      <w:r>
-        <w:t>CleanCode</w:t>
-      </w:r>
-      <w:proofErr w:type="spellEnd"/>
-      <w:r>
-        <w:t xml:space="preserve"> und entsprechender Codierungsrichtlinien, wurde neben </w:t>
-      </w:r>
-      <w:proofErr w:type="spellStart"/>
-      <w:r>
-        <w:t>s</w:t>
+        <w:t xml:space="preserve"> von CleanCode und entsprechender Codierungsrichtlinien, wurde neben </w:t>
+      </w:r>
+      <w:r>
+        <w:t>S</w:t>
       </w:r>
       <w:r>
         <w:t>orgfalt</w:t>
       </w:r>
-      <w:proofErr w:type="spellEnd"/>
-      <w:r>
-        <w:t xml:space="preserve"> der Entwickler, das Werkzeug </w:t>
-      </w:r>
-      <w:proofErr w:type="spellStart"/>
-      <w:r>
-        <w:t>Resharper</w:t>
-      </w:r>
-      <w:proofErr w:type="spellEnd"/>
-      <w:r>
-        <w:t xml:space="preserve"> verwendet</w:t>
+      <w:r>
+        <w:t xml:space="preserve"> der Entwickler, das Werkzeug Resharper verwendet</w:t>
       </w:r>
       <w:r>
         <w:t xml:space="preserve">. </w:t>
@@ -1821,15 +1664,13 @@
         <w:t>Verletzungen</w:t>
       </w:r>
       <w:r>
-        <w:t xml:space="preserve"> von </w:t>
-      </w:r>
-      <w:proofErr w:type="spellStart"/>
-      <w:r>
-        <w:t>Codierungsrichlinien</w:t>
-      </w:r>
-      <w:proofErr w:type="spellEnd"/>
-      <w:r>
-        <w:t xml:space="preserve"> (Namenskonventionen, Einrückung, </w:t>
+        <w:t xml:space="preserve"> von Codierungsrich</w:t>
+      </w:r>
+      <w:r>
+        <w:t>t</w:t>
+      </w:r>
+      <w:r>
+        <w:t xml:space="preserve">linien (Namenskonventionen, Einrückung, </w:t>
       </w:r>
       <w:r>
         <w:t>Formatierung</w:t>
@@ -1837,35 +1678,23 @@
       <w:r>
         <w:t xml:space="preserve">...) erkennen. Die verwendeten </w:t>
       </w:r>
-      <w:proofErr w:type="spellStart"/>
-      <w:r>
-        <w:t>Codierungsrichlinien</w:t>
-      </w:r>
-      <w:proofErr w:type="spellEnd"/>
-      <w:r>
-        <w:t xml:space="preserve"> sind die von der Firma </w:t>
-      </w:r>
-      <w:proofErr w:type="spellStart"/>
-      <w:r>
-        <w:t>Jetbrains</w:t>
-      </w:r>
-      <w:proofErr w:type="spellEnd"/>
-      <w:r>
-        <w:t xml:space="preserve"> empfohlenen</w:t>
+      <w:r>
+        <w:t>Codierungsrich</w:t>
+      </w:r>
+      <w:r>
+        <w:t>t</w:t>
+      </w:r>
+      <w:r>
+        <w:t xml:space="preserve">linien </w:t>
+      </w:r>
+      <w:r>
+        <w:t>sind die von der Firma Jetbrains empfohlenen</w:t>
       </w:r>
       <w:r>
         <w:t xml:space="preserve"> </w:t>
       </w:r>
       <w:r>
-        <w:t xml:space="preserve">und im </w:t>
-      </w:r>
-      <w:proofErr w:type="spellStart"/>
-      <w:r>
-        <w:t>Resharper</w:t>
-      </w:r>
-      <w:proofErr w:type="spellEnd"/>
-      <w:r>
-        <w:t xml:space="preserve"> vorkonfigurierten Richtlinien:</w:t>
+        <w:t>und im Resharper vorkonfigurierten Richtlinien:</w:t>
       </w:r>
       <w:r>
         <w:t xml:space="preserve"> </w:t>
@@ -2080,13 +1909,8 @@
         <w:spacing w:line="360" w:lineRule="auto"/>
       </w:pPr>
       <w:r>
-        <w:t xml:space="preserve">Projektmappe </w:t>
-      </w:r>
-      <w:proofErr w:type="spellStart"/>
-      <w:r>
-        <w:t>Hyperformer_ContactSplitter</w:t>
-      </w:r>
-      <w:proofErr w:type="spellEnd"/>
+        <w:t>Projektmappe Hyperformer_ContactSplitter</w:t>
+      </w:r>
     </w:p>
     <w:p>
       <w:pPr>
@@ -2099,79 +1923,66 @@
         <w:rPr>
           <w:lang w:val="en-US"/>
         </w:rPr>
-        <w:t xml:space="preserve">|__ </w:t>
-      </w:r>
-      <w:proofErr w:type="spellStart"/>
+        <w:t xml:space="preserve">|__ ContactsParser.Contracts    </w:t>
+      </w:r>
       <w:r>
         <w:rPr>
           <w:lang w:val="en-US"/>
         </w:rPr>
-        <w:t>ContactsParser.Contracts</w:t>
-      </w:r>
-      <w:proofErr w:type="spellEnd"/>
+        <w:tab/>
+      </w:r>
       <w:r>
         <w:rPr>
           <w:lang w:val="en-US"/>
         </w:rPr>
-        <w:t xml:space="preserve">    </w:t>
+        <w:tab/>
       </w:r>
       <w:r>
         <w:rPr>
           <w:lang w:val="en-US"/>
         </w:rPr>
+        <w:t>(</w:t>
+      </w:r>
+      <w:r>
+        <w:rPr>
+          <w:lang w:val="en-US"/>
+        </w:rPr>
+        <w:t>S</w:t>
+      </w:r>
+      <w:r>
+        <w:rPr>
+          <w:lang w:val="en-US"/>
+        </w:rPr>
+        <w:t>i</w:t>
+      </w:r>
+      <w:r>
+        <w:rPr>
+          <w:lang w:val="en-US"/>
+        </w:rPr>
+        <w:t>ehe Abschnitt "Composite Components")</w:t>
+      </w:r>
+    </w:p>
+    <w:p>
+      <w:pPr>
+        <w:spacing w:line="360" w:lineRule="auto"/>
+      </w:pPr>
+      <w:r>
+        <w:t xml:space="preserve">|__ ContactParser               </w:t>
+      </w:r>
+      <w:r>
         <w:tab/>
       </w:r>
       <w:r>
-        <w:rPr>
-          <w:lang w:val="en-US"/>
-        </w:rPr>
         <w:tab/>
       </w:r>
       <w:r>
-        <w:rPr>
-          <w:lang w:val="en-US"/>
-        </w:rPr>
-        <w:t>(</w:t>
-      </w:r>
-      <w:proofErr w:type="spellStart"/>
-      <w:r>
-        <w:rPr>
-          <w:lang w:val="en-US"/>
-        </w:rPr>
-        <w:t>S</w:t>
-      </w:r>
-      <w:r>
-        <w:rPr>
-          <w:lang w:val="en-US"/>
-        </w:rPr>
-        <w:t>i</w:t>
-      </w:r>
-      <w:r>
-        <w:rPr>
-          <w:lang w:val="en-US"/>
-        </w:rPr>
-        <w:t>ehe</w:t>
-      </w:r>
-      <w:proofErr w:type="spellEnd"/>
-      <w:r>
-        <w:rPr>
-          <w:lang w:val="en-US"/>
-        </w:rPr>
-        <w:t xml:space="preserve"> </w:t>
-      </w:r>
-      <w:proofErr w:type="spellStart"/>
-      <w:r>
-        <w:rPr>
-          <w:lang w:val="en-US"/>
-        </w:rPr>
-        <w:t>Abschnitt</w:t>
-      </w:r>
-      <w:proofErr w:type="spellEnd"/>
-      <w:r>
-        <w:rPr>
-          <w:lang w:val="en-US"/>
-        </w:rPr>
-        <w:t xml:space="preserve"> "Composite Components")</w:t>
+        <w:t xml:space="preserve">(Logik des </w:t>
+      </w:r>
+      <w:r>
+        <w:t xml:space="preserve">klassischen </w:t>
+      </w:r>
+      <w:r>
+        <w:t>Parsens)</w:t>
       </w:r>
     </w:p>
     <w:p>
@@ -2179,44 +1990,8 @@
         <w:spacing w:line="360" w:lineRule="auto"/>
       </w:pPr>
       <w:r>
-        <w:t xml:space="preserve">|__ </w:t>
-      </w:r>
-      <w:proofErr w:type="spellStart"/>
-      <w:r>
-        <w:t>ContactParser</w:t>
-      </w:r>
-      <w:proofErr w:type="spellEnd"/>
-      <w:r>
-        <w:t xml:space="preserve">               </w:t>
-      </w:r>
-      <w:r>
-        <w:tab/>
-      </w:r>
-      <w:r>
-        <w:tab/>
-      </w:r>
-      <w:r>
-        <w:t xml:space="preserve">(Logik des </w:t>
-      </w:r>
-      <w:r>
-        <w:t xml:space="preserve">klassischen </w:t>
-      </w:r>
-      <w:r>
-        <w:t>Parsens)</w:t>
-      </w:r>
-    </w:p>
-    <w:p>
-      <w:pPr>
-        <w:spacing w:line="360" w:lineRule="auto"/>
-      </w:pPr>
-      <w:r>
-        <w:t xml:space="preserve">|__ </w:t>
-      </w:r>
-      <w:proofErr w:type="spellStart"/>
-      <w:r>
-        <w:t>GPTContactParser</w:t>
-      </w:r>
-      <w:proofErr w:type="spellEnd"/>
+        <w:t>|__ GPTContactParser</w:t>
+      </w:r>
       <w:r>
         <w:tab/>
       </w:r>
@@ -2234,48 +2009,66 @@
         <w:ind w:left="3540" w:hanging="3540"/>
       </w:pPr>
       <w:r>
+        <w:t xml:space="preserve">|__ ContactSplitter.Control    </w:t>
+      </w:r>
+      <w:r>
+        <w:tab/>
+      </w:r>
+      <w:r>
+        <w:t>(</w:t>
+      </w:r>
+      <w:r>
+        <w:t xml:space="preserve">Wiederverwendbares </w:t>
+      </w:r>
+      <w:r>
+        <w:t>UI-Element</w:t>
+      </w:r>
+      <w:r>
+        <w:t xml:space="preserve">, </w:t>
+      </w:r>
+      <w:r>
+        <w:t xml:space="preserve">welches </w:t>
+      </w:r>
+      <w:r>
+        <w:t>Darstellung,</w:t>
+      </w:r>
+      <w:r>
+        <w:t xml:space="preserve"> </w:t>
+      </w:r>
+      <w:r>
+        <w:t>Eingabe</w:t>
+      </w:r>
+      <w:r>
+        <w:t xml:space="preserve">, </w:t>
+      </w:r>
+      <w:r>
+        <w:t>Ausgabe regelt)</w:t>
+      </w:r>
+    </w:p>
+    <w:p>
+      <w:pPr>
+        <w:spacing w:line="360" w:lineRule="auto"/>
+      </w:pPr>
+      <w:r>
         <w:t xml:space="preserve">|__ </w:t>
       </w:r>
-      <w:proofErr w:type="spellStart"/>
-      <w:r>
-        <w:t>ContactSplitter.Control</w:t>
-      </w:r>
-      <w:proofErr w:type="spellEnd"/>
-      <w:r>
-        <w:t xml:space="preserve">    </w:t>
+      <w:r>
+        <w:rPr>
+          <w:b/>
+        </w:rPr>
+        <w:t>ContactSplitter</w:t>
+      </w:r>
+      <w:r>
+        <w:t xml:space="preserve">             </w:t>
       </w:r>
       <w:r>
         <w:tab/>
       </w:r>
       <w:r>
-        <w:t>(</w:t>
-      </w:r>
-      <w:r>
-        <w:t xml:space="preserve">Wiederverwendbares </w:t>
-      </w:r>
-      <w:r>
-        <w:t>UI-Element</w:t>
-      </w:r>
-      <w:r>
-        <w:t xml:space="preserve">, </w:t>
-      </w:r>
-      <w:r>
-        <w:t xml:space="preserve">welches </w:t>
-      </w:r>
-      <w:r>
-        <w:t>Darstellung,</w:t>
-      </w:r>
-      <w:r>
-        <w:t xml:space="preserve"> </w:t>
-      </w:r>
-      <w:r>
-        <w:t>Eingabe</w:t>
-      </w:r>
-      <w:r>
-        <w:t xml:space="preserve">, </w:t>
-      </w:r>
-      <w:r>
-        <w:t>Ausgabe regelt)</w:t>
+        <w:tab/>
+      </w:r>
+      <w:r>
+        <w:t>(Hauptprojekt)</w:t>
       </w:r>
     </w:p>
     <w:p>
@@ -2283,41 +2076,8 @@
         <w:spacing w:line="360" w:lineRule="auto"/>
       </w:pPr>
       <w:r>
-        <w:t xml:space="preserve">|__ </w:t>
-      </w:r>
-      <w:proofErr w:type="spellStart"/>
-      <w:r>
-        <w:rPr>
-          <w:b/>
-        </w:rPr>
-        <w:t>ContactSplitter</w:t>
-      </w:r>
-      <w:proofErr w:type="spellEnd"/>
-      <w:r>
-        <w:t xml:space="preserve">             </w:t>
-      </w:r>
-      <w:r>
-        <w:tab/>
-      </w:r>
-      <w:r>
-        <w:tab/>
-      </w:r>
-      <w:r>
-        <w:t>(Hauptprojekt)</w:t>
-      </w:r>
-    </w:p>
-    <w:p>
-      <w:pPr>
-        <w:spacing w:line="360" w:lineRule="auto"/>
-      </w:pPr>
-      <w:r>
-        <w:t xml:space="preserve">|__ </w:t>
-      </w:r>
-      <w:proofErr w:type="spellStart"/>
-      <w:r>
-        <w:t>ContactSplitter.DataStorage</w:t>
-      </w:r>
-      <w:proofErr w:type="spellEnd"/>
+        <w:t>|__ ContactSplitter.DataStorage</w:t>
+      </w:r>
       <w:r>
         <w:tab/>
         <w:t>(Datenhaltung aller Kontakte usw.)</w:t>
@@ -2328,15 +2088,7 @@
         <w:spacing w:line="360" w:lineRule="auto"/>
       </w:pPr>
       <w:r>
-        <w:t xml:space="preserve">|__ </w:t>
-      </w:r>
-      <w:proofErr w:type="spellStart"/>
-      <w:r>
-        <w:t>ContactSplitter.Tests</w:t>
-      </w:r>
-      <w:proofErr w:type="spellEnd"/>
-      <w:r>
-        <w:t xml:space="preserve">       </w:t>
+        <w:t xml:space="preserve">|__ ContactSplitter.Tests       </w:t>
       </w:r>
       <w:r>
         <w:tab/>
@@ -2362,15 +2114,7 @@
         <w:t>Es handelt sich um jeweils einzelne Projekte</w:t>
       </w:r>
       <w:r>
-        <w:t xml:space="preserve"> (</w:t>
-      </w:r>
-      <w:proofErr w:type="spellStart"/>
-      <w:r>
-        <w:t>Assemblies</w:t>
-      </w:r>
-      <w:proofErr w:type="spellEnd"/>
-      <w:r>
-        <w:t>)</w:t>
+        <w:t xml:space="preserve"> (Assemblies)</w:t>
       </w:r>
       <w:r>
         <w:t>, welche in einer Projektmappe</w:t>
@@ -2382,15 +2126,13 @@
         <w:t xml:space="preserve"> zusammengefasst sind und interagieren</w:t>
       </w:r>
       <w:r>
-        <w:t xml:space="preserve">. Auf den folgenden Seiten sind Abbildungen zu sehen, welche die einzelnen Klassendiagramme der Projekte </w:t>
-      </w:r>
-      <w:proofErr w:type="spellStart"/>
-      <w:r>
-        <w:t>dargestellen</w:t>
-      </w:r>
-      <w:proofErr w:type="spellEnd"/>
-      <w:r>
-        <w:t xml:space="preserve">. </w:t>
+        <w:t xml:space="preserve">. Auf den </w:t>
+      </w:r>
+      <w:r>
+        <w:t>Seiten 9-11</w:t>
+      </w:r>
+      <w:r>
+        <w:t xml:space="preserve"> sind Abbildungen zu sehen, welche die einzelnen Klassendiagramme der Projekte darstellen. </w:t>
       </w:r>
     </w:p>
     <w:p>
@@ -2430,7 +2172,19 @@
         <w:rPr>
           <w:lang w:eastAsia="de-DE"/>
         </w:rPr>
-        <w:t>Als Nutzer möchte ich ein manuelles Textfenster haben, um die Zerlegung der Anrede manuell anzupassen, falls die automatische Zuordnung nicht korrekt ist oder ich den Kontant selbst eintragen möchte.</w:t>
+        <w:t xml:space="preserve">Als Nutzer möchte ich ein manuelles Textfenster haben, um die Zerlegung der Anrede manuell anzupassen, falls die automatische Zuordnung nicht korrekt ist oder ich den </w:t>
+      </w:r>
+      <w:r>
+        <w:rPr>
+          <w:lang w:eastAsia="de-DE"/>
+        </w:rPr>
+        <w:t>Kontakt</w:t>
+      </w:r>
+      <w:r>
+        <w:rPr>
+          <w:lang w:eastAsia="de-DE"/>
+        </w:rPr>
+        <w:t xml:space="preserve"> selbst eintragen möchte.</w:t>
       </w:r>
     </w:p>
     <w:p>
@@ -2445,14 +2199,26 @@
       <w:pPr>
         <w:pStyle w:val="Listenabsatz"/>
         <w:rPr>
-          <w:lang w:eastAsia="de-DE"/>
-        </w:rPr>
-      </w:pPr>
-      <w:r>
-        <w:rPr>
+          <w:b/>
+          <w:bCs/>
+          <w:lang w:eastAsia="de-DE"/>
+        </w:rPr>
+      </w:pPr>
+      <w:r>
+        <w:rPr>
+          <w:b/>
+          <w:bCs/>
           <w:lang w:eastAsia="de-DE"/>
         </w:rPr>
         <w:t>Akzeptanzkriterien</w:t>
+      </w:r>
+      <w:r>
+        <w:rPr>
+          <w:b/>
+          <w:bCs/>
+          <w:lang w:eastAsia="de-DE"/>
+        </w:rPr>
+        <w:t>:</w:t>
       </w:r>
     </w:p>
     <w:p>
@@ -2464,13 +2230,13 @@
         </w:numPr>
       </w:pPr>
       <w:r>
-        <w:t xml:space="preserve">Das System sollte ein Textfeld zur Verfügung stellen, in dem Nutzer Anreden manuell </w:t>
-      </w:r>
-      <w:r>
-        <w:t xml:space="preserve"> </w:t>
-      </w:r>
-      <w:r>
-        <w:t xml:space="preserve">bearbeiten können. </w:t>
+        <w:t xml:space="preserve">Das System sollte ein Textfeld zur Verfügung stellen, in dem Nutzer Anreden </w:t>
+      </w:r>
+      <w:r>
+        <w:t>manuell bearbeiten</w:t>
+      </w:r>
+      <w:r>
+        <w:t xml:space="preserve"> können. </w:t>
       </w:r>
     </w:p>
     <w:p>
@@ -2491,6 +2257,9 @@
         <w:t>Personenmerkmale</w:t>
       </w:r>
       <w:r>
+        <w:t>n</w:t>
+      </w:r>
+      <w:r>
         <w:t xml:space="preserve"> gefüllt werden</w:t>
       </w:r>
     </w:p>
@@ -2522,9 +2291,24 @@
     <w:p>
       <w:pPr>
         <w:pStyle w:val="Listenabsatz"/>
-      </w:pPr>
-      <w:r>
+        <w:rPr>
+          <w:b/>
+          <w:bCs/>
+        </w:rPr>
+      </w:pPr>
+      <w:r>
+        <w:rPr>
+          <w:b/>
+          <w:bCs/>
+        </w:rPr>
         <w:t>Akzeptanzkriterien</w:t>
+      </w:r>
+      <w:r>
+        <w:rPr>
+          <w:b/>
+          <w:bCs/>
+        </w:rPr>
+        <w:t>:</w:t>
       </w:r>
     </w:p>
     <w:p>
@@ -2606,9 +2390,19 @@
       </w:pPr>
       <w:r>
         <w:rPr>
-          <w:lang w:eastAsia="de-DE"/>
-        </w:rPr>
-        <w:t>Akzeptanzkriterien:</w:t>
+          <w:b/>
+          <w:bCs/>
+          <w:lang w:eastAsia="de-DE"/>
+        </w:rPr>
+        <w:t>Akzeptanzkriterie</w:t>
+      </w:r>
+      <w:r>
+        <w:rPr>
+          <w:b/>
+          <w:bCs/>
+          <w:lang w:eastAsia="de-DE"/>
+        </w:rPr>
+        <w:t>n:</w:t>
       </w:r>
     </w:p>
     <w:p>
@@ -2661,9 +2455,17 @@
       </w:pPr>
       <w:r>
         <w:rPr>
-          <w:lang w:eastAsia="de-DE"/>
-        </w:rPr>
-        <w:t>Akzeptanzkriterien:</w:t>
+          <w:b/>
+          <w:bCs/>
+          <w:lang w:eastAsia="de-DE"/>
+        </w:rPr>
+        <w:t>Akzeptanzkriterien</w:t>
+      </w:r>
+      <w:r>
+        <w:rPr>
+          <w:lang w:eastAsia="de-DE"/>
+        </w:rPr>
+        <w:t>:</w:t>
       </w:r>
     </w:p>
     <w:p>
@@ -2744,30 +2546,8 @@
         <w:rPr>
           <w:lang w:eastAsia="de-DE"/>
         </w:rPr>
-        <w:t xml:space="preserve">Definition </w:t>
-      </w:r>
-      <w:proofErr w:type="spellStart"/>
-      <w:r>
-        <w:rPr>
-          <w:lang w:eastAsia="de-DE"/>
-        </w:rPr>
-        <w:t>Of</w:t>
-      </w:r>
-      <w:proofErr w:type="spellEnd"/>
-      <w:r>
-        <w:rPr>
-          <w:lang w:eastAsia="de-DE"/>
-        </w:rPr>
-        <w:t xml:space="preserve"> </w:t>
-      </w:r>
-      <w:proofErr w:type="spellStart"/>
-      <w:r>
-        <w:rPr>
-          <w:lang w:eastAsia="de-DE"/>
-        </w:rPr>
-        <w:t>Done</w:t>
-      </w:r>
-      <w:proofErr w:type="spellEnd"/>
+        <w:t>Definition Of Done</w:t>
+      </w:r>
     </w:p>
     <w:p>
       <w:pPr>
@@ -2784,7 +2564,13 @@
         <w:rPr>
           <w:lang w:eastAsia="de-DE"/>
         </w:rPr>
-        <w:t>Alle Anforderungen des Kunden und des Entwicklerteams sind erfüllt und umgesetzt.</w:t>
+        <w:t>Alle Anforderungen des Kunden und des Entwicklerteams sind erfüllt und umgesetzt</w:t>
+      </w:r>
+      <w:r>
+        <w:rPr>
+          <w:lang w:eastAsia="de-DE"/>
+        </w:rPr>
+        <w:t>.</w:t>
       </w:r>
     </w:p>
     <w:p>
@@ -2931,15 +2717,13 @@
         <w:t xml:space="preserve">Titel </w:t>
       </w:r>
       <w:r>
-        <w:t xml:space="preserve">zu konfigurieren, um künftige </w:t>
-      </w:r>
-      <w:proofErr w:type="spellStart"/>
-      <w:r>
-        <w:t>Parsevorgänge</w:t>
-      </w:r>
-      <w:proofErr w:type="spellEnd"/>
-      <w:r>
-        <w:t xml:space="preserve"> zu optimieren</w:t>
+        <w:t>zu konfigurieren, um künftige Parse</w:t>
+      </w:r>
+      <w:r>
+        <w:t>-</w:t>
+      </w:r>
+      <w:r>
+        <w:t>vorgänge zu optimieren</w:t>
       </w:r>
       <w:r>
         <w:t>.</w:t>
@@ -2978,7 +2762,19 @@
         <w:rPr>
           <w:lang w:eastAsia="de-DE"/>
         </w:rPr>
-        <w:t>Die App ist gut dokumentiert, einschließlich der Funktionsweise, der Systemanforderungen und der</w:t>
+        <w:t xml:space="preserve">Die App ist </w:t>
+      </w:r>
+      <w:r>
+        <w:rPr>
+          <w:lang w:eastAsia="de-DE"/>
+        </w:rPr>
+        <w:t>umfänglich</w:t>
+      </w:r>
+      <w:r>
+        <w:rPr>
+          <w:lang w:eastAsia="de-DE"/>
+        </w:rPr>
+        <w:t xml:space="preserve"> dokumentiert, einschließlich der Funktionsweise, der Systemanforderungen und der</w:t>
       </w:r>
       <w:r>
         <w:rPr>
@@ -3008,7 +2804,7 @@
         <w:rPr>
           <w:lang w:eastAsia="de-DE"/>
         </w:rPr>
-        <w:t>Die App ist erfolgreich getestet und alle Fehler und Bugs sind behoben.</w:t>
+        <w:t xml:space="preserve">Die Dokumentation der App ist für das erste Release angepasst. </w:t>
       </w:r>
     </w:p>
     <w:p>
@@ -3026,7 +2822,85 @@
         <w:rPr>
           <w:lang w:eastAsia="de-DE"/>
         </w:rPr>
-        <w:t>Die App ist bereit für die Veröffentlichung und wird von den Benutzern positiv aufgenommen.</w:t>
+        <w:t xml:space="preserve">Die App </w:t>
+      </w:r>
+      <w:r>
+        <w:rPr>
+          <w:lang w:eastAsia="de-DE"/>
+        </w:rPr>
+        <w:t>ist</w:t>
+      </w:r>
+      <w:r>
+        <w:rPr>
+          <w:lang w:eastAsia="de-DE"/>
+        </w:rPr>
+        <w:t xml:space="preserve"> erfolgreich getestet und </w:t>
+      </w:r>
+      <w:r>
+        <w:rPr>
+          <w:lang w:eastAsia="de-DE"/>
+        </w:rPr>
+        <w:t xml:space="preserve">alle </w:t>
+      </w:r>
+      <w:r>
+        <w:rPr>
+          <w:lang w:eastAsia="de-DE"/>
+        </w:rPr>
+        <w:t>gefundenen Fehler</w:t>
+      </w:r>
+      <w:r>
+        <w:rPr>
+          <w:lang w:eastAsia="de-DE"/>
+        </w:rPr>
+        <w:t xml:space="preserve"> und Bugs </w:t>
+      </w:r>
+      <w:r>
+        <w:rPr>
+          <w:lang w:eastAsia="de-DE"/>
+        </w:rPr>
+        <w:t>sind</w:t>
+      </w:r>
+      <w:r>
+        <w:rPr>
+          <w:lang w:eastAsia="de-DE"/>
+        </w:rPr>
+        <w:t xml:space="preserve"> </w:t>
+      </w:r>
+      <w:r>
+        <w:rPr>
+          <w:lang w:eastAsia="de-DE"/>
+        </w:rPr>
+        <w:t>behoben.</w:t>
+      </w:r>
+    </w:p>
+    <w:p>
+      <w:pPr>
+        <w:pStyle w:val="Listenabsatz"/>
+        <w:numPr>
+          <w:ilvl w:val="0"/>
+          <w:numId w:val="2"/>
+        </w:numPr>
+        <w:rPr>
+          <w:lang w:eastAsia="de-DE"/>
+        </w:rPr>
+      </w:pPr>
+      <w:r>
+        <w:rPr>
+          <w:lang w:eastAsia="de-DE"/>
+        </w:rPr>
+        <w:t xml:space="preserve">Die App </w:t>
+      </w:r>
+      <w:r>
+        <w:rPr>
+          <w:lang w:eastAsia="de-DE"/>
+        </w:rPr>
+        <w:t>ist bereit für die Veröffentlichung und wird vom Kunden akzeptiert.</w:t>
+      </w:r>
+      <w:r>
+        <w:rPr>
+          <w:lang w:eastAsia="de-DE"/>
+        </w:rPr>
+        <w:t xml:space="preserve"> </w:t>
       </w:r>
     </w:p>
     <w:p>
@@ -3244,7 +3118,19 @@
         <w:rPr>
           <w:lang w:eastAsia="de-DE"/>
         </w:rPr>
-        <w:t xml:space="preserve"> derzeit nur für Windows Geräte verfügbar.</w:t>
+        <w:t xml:space="preserve"> </w:t>
+      </w:r>
+      <w:r>
+        <w:rPr>
+          <w:lang w:eastAsia="de-DE"/>
+        </w:rPr>
+        <w:t xml:space="preserve">ist </w:t>
+      </w:r>
+      <w:r>
+        <w:rPr>
+          <w:lang w:eastAsia="de-DE"/>
+        </w:rPr>
+        <w:t>derzeit nur für Windows Geräte verfügbar.</w:t>
       </w:r>
     </w:p>
     <w:p>
@@ -3268,7 +3154,25 @@
         <w:rPr>
           <w:lang w:eastAsia="de-DE"/>
         </w:rPr>
-        <w:t>Ausführbare Exe Dateien</w:t>
+        <w:t>a</w:t>
+      </w:r>
+      <w:r>
+        <w:rPr>
+          <w:lang w:eastAsia="de-DE"/>
+        </w:rPr>
+        <w:t xml:space="preserve">usführbare </w:t>
+      </w:r>
+      <w:r>
+        <w:rPr>
+          <w:lang w:eastAsia="de-DE"/>
+        </w:rPr>
+        <w:t>exe</w:t>
+      </w:r>
+      <w:r>
+        <w:rPr>
+          <w:lang w:eastAsia="de-DE"/>
+        </w:rPr>
+        <w:t xml:space="preserve"> Dateien</w:t>
       </w:r>
     </w:p>
     <w:p>
@@ -3282,39 +3186,17 @@
           <w:lang w:eastAsia="de-DE"/>
         </w:rPr>
       </w:pPr>
-      <w:proofErr w:type="spellStart"/>
-      <w:r>
-        <w:rPr>
-          <w:lang w:eastAsia="de-DE"/>
-        </w:rPr>
-        <w:t>ContactSplitter</w:t>
-      </w:r>
-      <w:proofErr w:type="spellEnd"/>
-      <w:r>
-        <w:rPr>
-          <w:lang w:eastAsia="de-DE"/>
-        </w:rPr>
-        <w:t xml:space="preserve"> 1.0.exe</w:t>
-      </w:r>
-      <w:r>
-        <w:rPr>
-          <w:lang w:eastAsia="de-DE"/>
-        </w:rPr>
-        <w:t xml:space="preserve"> (Beinhaltet die .NET 7.0 </w:t>
-      </w:r>
-      <w:proofErr w:type="spellStart"/>
-      <w:r>
-        <w:rPr>
-          <w:lang w:eastAsia="de-DE"/>
-        </w:rPr>
-        <w:t>Runtime</w:t>
-      </w:r>
-      <w:proofErr w:type="spellEnd"/>
-      <w:r>
-        <w:rPr>
-          <w:lang w:eastAsia="de-DE"/>
-        </w:rPr>
-        <w:t>)</w:t>
+      <w:r>
+        <w:rPr>
+          <w:lang w:eastAsia="de-DE"/>
+        </w:rPr>
+        <w:t>ContactSplitter 1.0.exe</w:t>
+      </w:r>
+      <w:r>
+        <w:rPr>
+          <w:lang w:eastAsia="de-DE"/>
+        </w:rPr>
+        <w:t xml:space="preserve"> (Beinhaltet die .NET 7.0 Runtime)</w:t>
       </w:r>
     </w:p>
     <w:p>
@@ -3328,59 +3210,23 @@
           <w:lang w:val="en-US" w:eastAsia="de-DE"/>
         </w:rPr>
       </w:pPr>
-      <w:proofErr w:type="spellStart"/>
       <w:r>
         <w:rPr>
           <w:lang w:val="en-US" w:eastAsia="de-DE"/>
         </w:rPr>
-        <w:t>ContactSplitter</w:t>
-      </w:r>
-      <w:proofErr w:type="spellEnd"/>
+        <w:t>ContactSplitter 1.0 (.NET 7 Runtime required)</w:t>
+      </w:r>
       <w:r>
         <w:rPr>
           <w:lang w:val="en-US" w:eastAsia="de-DE"/>
         </w:rPr>
-        <w:t xml:space="preserve"> 1.0 (.NET 7 Runtime required)</w:t>
+        <w:t>.e</w:t>
       </w:r>
       <w:r>
         <w:rPr>
           <w:lang w:val="en-US" w:eastAsia="de-DE"/>
         </w:rPr>
-        <w:t>.e</w:t>
-      </w:r>
-      <w:r>
-        <w:rPr>
-          <w:lang w:val="en-US" w:eastAsia="de-DE"/>
-        </w:rPr>
-        <w:t>xe (</w:t>
-      </w:r>
-      <w:proofErr w:type="spellStart"/>
-      <w:r>
-        <w:rPr>
-          <w:lang w:val="en-US" w:eastAsia="de-DE"/>
-        </w:rPr>
-        <w:t>Benötigt</w:t>
-      </w:r>
-      <w:proofErr w:type="spellEnd"/>
-      <w:r>
-        <w:rPr>
-          <w:lang w:val="en-US" w:eastAsia="de-DE"/>
-        </w:rPr>
-        <w:t xml:space="preserve"> </w:t>
-      </w:r>
-      <w:proofErr w:type="spellStart"/>
-      <w:r>
-        <w:rPr>
-          <w:lang w:val="en-US" w:eastAsia="de-DE"/>
-        </w:rPr>
-        <w:t>eine</w:t>
-      </w:r>
-      <w:proofErr w:type="spellEnd"/>
-      <w:r>
-        <w:rPr>
-          <w:lang w:val="en-US" w:eastAsia="de-DE"/>
-        </w:rPr>
-        <w:t xml:space="preserve"> Installation der .NET 7 Runtime: </w:t>
+        <w:t xml:space="preserve">xe (Benötigt eine Installation der .NET 7 Runtime: </w:t>
       </w:r>
       <w:r>
         <w:rPr>
@@ -3492,14 +3338,12 @@
         </w:rPr>
         <w:t xml:space="preserve">Diese </w:t>
       </w:r>
-      <w:proofErr w:type="spellStart"/>
-      <w:r>
-        <w:rPr>
-          <w:lang w:eastAsia="de-DE"/>
-        </w:rPr>
-        <w:t>Releasenote</w:t>
-      </w:r>
-      <w:proofErr w:type="spellEnd"/>
+      <w:r>
+        <w:rPr>
+          <w:lang w:eastAsia="de-DE"/>
+        </w:rPr>
+        <w:t>Release Note</w:t>
+      </w:r>
       <w:r>
         <w:rPr>
           <w:lang w:eastAsia="de-DE"/>
@@ -3554,7 +3398,7 @@
             <v:path o:extrusionok="f" gradientshapeok="t" o:connecttype="rect"/>
             <o:lock v:ext="edit" aspectratio="t"/>
           </v:shapetype>
-          <v:shape id="_x0000_i1025" type="#_x0000_t75" style="width:641pt;height:5in;rotation:270;mso-position-horizontal-relative:text;mso-position-vertical-relative:text" wrapcoords="-36 0 -36 21536 21600 21536 21600 0 -36 0" o:allowoverlap="f">
+          <v:shape id="_x0000_i1025" type="#_x0000_t75" style="width:641.1pt;height:5in;rotation:270;mso-position-horizontal-relative:text;mso-position-vertical-relative:text" wrapcoords="-36 0 -36 21536 21600 21536 21600 0 -36 0" o:allowoverlap="f">
             <v:imagedata r:id="rId15" o:title="One"/>
           </v:shape>
         </w:pict>
@@ -3589,7 +3433,7 @@
       <w:r>
         <w:lastRenderedPageBreak/>
         <w:pict w14:anchorId="5A570667">
-          <v:shape id="_x0000_i1026" type="#_x0000_t75" style="width:351.4pt;height:625.95pt;mso-left-percent:-10001;mso-top-percent:-10001;mso-position-horizontal:absolute;mso-position-horizontal-relative:char;mso-position-vertical:absolute;mso-position-vertical-relative:line;mso-left-percent:-10001;mso-top-percent:-10001">
+          <v:shape id="_x0000_i1026" type="#_x0000_t75" style="width:351.25pt;height:626.1pt;mso-left-percent:-10001;mso-top-percent:-10001;mso-position-horizontal:absolute;mso-position-horizontal-relative:char;mso-position-vertical:absolute;mso-position-vertical-relative:line;mso-left-percent:-10001;mso-top-percent:-10001">
             <v:imagedata r:id="rId16" o:title="Tow"/>
           </v:shape>
         </w:pict>
@@ -3625,7 +3469,7 @@
       <w:r>
         <w:lastRenderedPageBreak/>
         <w:pict w14:anchorId="33698A8F">
-          <v:shape id="_x0000_i1027" type="#_x0000_t75" style="width:361.6pt;height:644.25pt;mso-left-percent:-10001;mso-top-percent:-10001;mso-position-horizontal:absolute;mso-position-horizontal-relative:char;mso-position-vertical:absolute;mso-position-vertical-relative:line;mso-left-percent:-10001;mso-top-percent:-10001">
+          <v:shape id="_x0000_i1027" type="#_x0000_t75" style="width:361.9pt;height:644.25pt;mso-left-percent:-10001;mso-top-percent:-10001;mso-position-horizontal:absolute;mso-position-horizontal-relative:char;mso-position-vertical:absolute;mso-position-vertical-relative:line;mso-left-percent:-10001;mso-top-percent:-10001">
             <v:imagedata r:id="rId17" o:title="Three"/>
           </v:shape>
         </w:pict>
@@ -3667,7 +3511,7 @@
 </file>
 
 <file path=word/endnotes.xml><?xml version="1.0" encoding="utf-8"?>
-<w:endnotes xmlns:wpc="http://schemas.microsoft.com/office/word/2010/wordprocessingCanvas" xmlns:cx="http://schemas.microsoft.com/office/drawing/2014/chartex" xmlns:cx1="http://schemas.microsoft.com/office/drawing/2015/9/8/chartex" xmlns:cx2="http://schemas.microsoft.com/office/drawing/2015/10/21/chartex" xmlns:cx3="http://schemas.microsoft.com/office/drawing/2016/5/9/chartex" xmlns:cx4="http://schemas.microsoft.com/office/drawing/2016/5/10/chartex" xmlns:cx5="http://schemas.microsoft.com/office/drawing/2016/5/11/chartex" xmlns:cx6="http://schemas.microsoft.com/office/drawing/2016/5/12/chartex" xmlns:cx7="http://schemas.microsoft.com/office/drawing/2016/5/13/chartex" xmlns:cx8="http://schemas.microsoft.com/office/drawing/2016/5/14/chartex" xmlns:mc="http://schemas.openxmlformats.org/markup-compatibility/2006" xmlns:aink="http://schemas.microsoft.com/office/drawing/2016/ink" xmlns:am3d="http://schemas.microsoft.com/office/drawing/2017/model3d" xmlns:o="urn:schemas-microsoft-com:office:office" xmlns:oel="http://schemas.microsoft.com/office/2019/extlst" xmlns:r="http://schemas.openxmlformats.org/officeDocument/2006/relationships" xmlns:m="http://schemas.openxmlformats.org/officeDocument/2006/math" xmlns:v="urn:schemas-microsoft-com:vml" xmlns:wp14="http://schemas.microsoft.com/office/word/2010/wordprocessingDrawing" xmlns:wp="http://schemas.openxmlformats.org/drawingml/2006/wordprocessingDrawing" xmlns:w10="urn:schemas-microsoft-com:office:word" xmlns:w="http://schemas.openxmlformats.org/wordprocessingml/2006/main" xmlns:w14="http://schemas.microsoft.com/office/word/2010/wordml" xmlns:w15="http://schemas.microsoft.com/office/word/2012/wordml" xmlns:w16cex="http://schemas.microsoft.com/office/word/2018/wordml/cex" xmlns:w16cid="http://schemas.microsoft.com/office/word/2016/wordml/cid" xmlns:w16="http://schemas.microsoft.com/office/word/2018/wordml" xmlns:w16du="http://schemas.microsoft.com/office/word/2023/wordml/word16du" xmlns:w16sdtdh="http://schemas.microsoft.com/office/word/2020/wordml/sdtdatahash" xmlns:w16se="http://schemas.microsoft.com/office/word/2015/wordml/symex" xmlns:wpg="http://schemas.microsoft.com/office/word/2010/wordprocessingGroup" xmlns:wpi="http://schemas.microsoft.com/office/word/2010/wordprocessingInk" xmlns:wne="http://schemas.microsoft.com/office/word/2006/wordml" xmlns:wps="http://schemas.microsoft.com/office/word/2010/wordprocessingShape" mc:Ignorable="w14 w15 w16se w16cid w16 w16cex w16sdtdh wp14">
+<w:endnotes xmlns:wpc="http://schemas.microsoft.com/office/word/2010/wordprocessingCanvas" xmlns:cx="http://schemas.microsoft.com/office/drawing/2014/chartex" xmlns:cx1="http://schemas.microsoft.com/office/drawing/2015/9/8/chartex" xmlns:cx2="http://schemas.microsoft.com/office/drawing/2015/10/21/chartex" xmlns:cx3="http://schemas.microsoft.com/office/drawing/2016/5/9/chartex" xmlns:cx4="http://schemas.microsoft.com/office/drawing/2016/5/10/chartex" xmlns:cx5="http://schemas.microsoft.com/office/drawing/2016/5/11/chartex" xmlns:cx6="http://schemas.microsoft.com/office/drawing/2016/5/12/chartex" xmlns:cx7="http://schemas.microsoft.com/office/drawing/2016/5/13/chartex" xmlns:cx8="http://schemas.microsoft.com/office/drawing/2016/5/14/chartex" xmlns:mc="http://schemas.openxmlformats.org/markup-compatibility/2006" xmlns:aink="http://schemas.microsoft.com/office/drawing/2016/ink" xmlns:am3d="http://schemas.microsoft.com/office/drawing/2017/model3d" xmlns:o="urn:schemas-microsoft-com:office:office" xmlns:oel="http://schemas.microsoft.com/office/2019/extlst" xmlns:r="http://schemas.openxmlformats.org/officeDocument/2006/relationships" xmlns:m="http://schemas.openxmlformats.org/officeDocument/2006/math" xmlns:v="urn:schemas-microsoft-com:vml" xmlns:wp14="http://schemas.microsoft.com/office/word/2010/wordprocessingDrawing" xmlns:wp="http://schemas.openxmlformats.org/drawingml/2006/wordprocessingDrawing" xmlns:w10="urn:schemas-microsoft-com:office:word" xmlns:w="http://schemas.openxmlformats.org/wordprocessingml/2006/main" xmlns:w14="http://schemas.microsoft.com/office/word/2010/wordml" xmlns:w15="http://schemas.microsoft.com/office/word/2012/wordml" xmlns:w16cex="http://schemas.microsoft.com/office/word/2018/wordml/cex" xmlns:w16cid="http://schemas.microsoft.com/office/word/2016/wordml/cid" xmlns:w16="http://schemas.microsoft.com/office/word/2018/wordml" xmlns:w16sdtdh="http://schemas.microsoft.com/office/word/2020/wordml/sdtdatahash" xmlns:w16se="http://schemas.microsoft.com/office/word/2015/wordml/symex" xmlns:wpg="http://schemas.microsoft.com/office/word/2010/wordprocessingGroup" xmlns:wpi="http://schemas.microsoft.com/office/word/2010/wordprocessingInk" xmlns:wne="http://schemas.microsoft.com/office/word/2006/wordml" xmlns:wps="http://schemas.microsoft.com/office/word/2010/wordprocessingShape" mc:Ignorable="w14 w15 w16se w16cid w16 w16cex w16sdtdh wp14">
   <w:endnote w:type="separator" w:id="-1">
     <w:p>
       <w:pPr>
@@ -3692,7 +3536,7 @@
 </file>
 
 <file path=word/footer1.xml><?xml version="1.0" encoding="utf-8"?>
-<w:ftr xmlns:wpc="http://schemas.microsoft.com/office/word/2010/wordprocessingCanvas" xmlns:cx="http://schemas.microsoft.com/office/drawing/2014/chartex" xmlns:cx1="http://schemas.microsoft.com/office/drawing/2015/9/8/chartex" xmlns:cx2="http://schemas.microsoft.com/office/drawing/2015/10/21/chartex" xmlns:cx3="http://schemas.microsoft.com/office/drawing/2016/5/9/chartex" xmlns:cx4="http://schemas.microsoft.com/office/drawing/2016/5/10/chartex" xmlns:cx5="http://schemas.microsoft.com/office/drawing/2016/5/11/chartex" xmlns:cx6="http://schemas.microsoft.com/office/drawing/2016/5/12/chartex" xmlns:cx7="http://schemas.microsoft.com/office/drawing/2016/5/13/chartex" xmlns:cx8="http://schemas.microsoft.com/office/drawing/2016/5/14/chartex" xmlns:mc="http://schemas.openxmlformats.org/markup-compatibility/2006" xmlns:aink="http://schemas.microsoft.com/office/drawing/2016/ink" xmlns:am3d="http://schemas.microsoft.com/office/drawing/2017/model3d" xmlns:o="urn:schemas-microsoft-com:office:office" xmlns:oel="http://schemas.microsoft.com/office/2019/extlst" xmlns:r="http://schemas.openxmlformats.org/officeDocument/2006/relationships" xmlns:m="http://schemas.openxmlformats.org/officeDocument/2006/math" xmlns:v="urn:schemas-microsoft-com:vml" xmlns:wp14="http://schemas.microsoft.com/office/word/2010/wordprocessingDrawing" xmlns:wp="http://schemas.openxmlformats.org/drawingml/2006/wordprocessingDrawing" xmlns:w10="urn:schemas-microsoft-com:office:word" xmlns:w="http://schemas.openxmlformats.org/wordprocessingml/2006/main" xmlns:w14="http://schemas.microsoft.com/office/word/2010/wordml" xmlns:w15="http://schemas.microsoft.com/office/word/2012/wordml" xmlns:w16cex="http://schemas.microsoft.com/office/word/2018/wordml/cex" xmlns:w16cid="http://schemas.microsoft.com/office/word/2016/wordml/cid" xmlns:w16="http://schemas.microsoft.com/office/word/2018/wordml" xmlns:w16du="http://schemas.microsoft.com/office/word/2023/wordml/word16du" xmlns:w16sdtdh="http://schemas.microsoft.com/office/word/2020/wordml/sdtdatahash" xmlns:w16se="http://schemas.microsoft.com/office/word/2015/wordml/symex" xmlns:wpg="http://schemas.microsoft.com/office/word/2010/wordprocessingGroup" xmlns:wpi="http://schemas.microsoft.com/office/word/2010/wordprocessingInk" xmlns:wne="http://schemas.microsoft.com/office/word/2006/wordml" xmlns:wps="http://schemas.microsoft.com/office/word/2010/wordprocessingShape" mc:Ignorable="w14 w15 w16se w16cid w16 w16cex w16sdtdh wp14">
+<w:ftr xmlns:wpc="http://schemas.microsoft.com/office/word/2010/wordprocessingCanvas" xmlns:cx="http://schemas.microsoft.com/office/drawing/2014/chartex" xmlns:cx1="http://schemas.microsoft.com/office/drawing/2015/9/8/chartex" xmlns:cx2="http://schemas.microsoft.com/office/drawing/2015/10/21/chartex" xmlns:cx3="http://schemas.microsoft.com/office/drawing/2016/5/9/chartex" xmlns:cx4="http://schemas.microsoft.com/office/drawing/2016/5/10/chartex" xmlns:cx5="http://schemas.microsoft.com/office/drawing/2016/5/11/chartex" xmlns:cx6="http://schemas.microsoft.com/office/drawing/2016/5/12/chartex" xmlns:cx7="http://schemas.microsoft.com/office/drawing/2016/5/13/chartex" xmlns:cx8="http://schemas.microsoft.com/office/drawing/2016/5/14/chartex" xmlns:mc="http://schemas.openxmlformats.org/markup-compatibility/2006" xmlns:aink="http://schemas.microsoft.com/office/drawing/2016/ink" xmlns:am3d="http://schemas.microsoft.com/office/drawing/2017/model3d" xmlns:o="urn:schemas-microsoft-com:office:office" xmlns:oel="http://schemas.microsoft.com/office/2019/extlst" xmlns:r="http://schemas.openxmlformats.org/officeDocument/2006/relationships" xmlns:m="http://schemas.openxmlformats.org/officeDocument/2006/math" xmlns:v="urn:schemas-microsoft-com:vml" xmlns:wp14="http://schemas.microsoft.com/office/word/2010/wordprocessingDrawing" xmlns:wp="http://schemas.openxmlformats.org/drawingml/2006/wordprocessingDrawing" xmlns:w10="urn:schemas-microsoft-com:office:word" xmlns:w="http://schemas.openxmlformats.org/wordprocessingml/2006/main" xmlns:w14="http://schemas.microsoft.com/office/word/2010/wordml" xmlns:w15="http://schemas.microsoft.com/office/word/2012/wordml" xmlns:w16cex="http://schemas.microsoft.com/office/word/2018/wordml/cex" xmlns:w16cid="http://schemas.microsoft.com/office/word/2016/wordml/cid" xmlns:w16="http://schemas.microsoft.com/office/word/2018/wordml" xmlns:w16sdtdh="http://schemas.microsoft.com/office/word/2020/wordml/sdtdatahash" xmlns:w16se="http://schemas.microsoft.com/office/word/2015/wordml/symex" xmlns:wpg="http://schemas.microsoft.com/office/word/2010/wordprocessingGroup" xmlns:wpi="http://schemas.microsoft.com/office/word/2010/wordprocessingInk" xmlns:wne="http://schemas.microsoft.com/office/word/2006/wordml" xmlns:wps="http://schemas.microsoft.com/office/word/2010/wordprocessingShape" mc:Ignorable="w14 w15 w16se w16cid w16 w16cex w16sdtdh wp14">
   <w:p>
     <w:pPr>
       <w:pStyle w:val="Fuzeile"/>
@@ -3740,7 +3584,7 @@
         <w:rPr>
           <w:noProof/>
         </w:rPr>
-        <w:t>Dokumentation.docx</w:t>
+        <w:t>Dokumentation</w:t>
       </w:r>
     </w:fldSimple>
   </w:p>
@@ -3748,7 +3592,7 @@
 </file>
 
 <file path=word/footnotes.xml><?xml version="1.0" encoding="utf-8"?>
-<w:footnotes xmlns:wpc="http://schemas.microsoft.com/office/word/2010/wordprocessingCanvas" xmlns:cx="http://schemas.microsoft.com/office/drawing/2014/chartex" xmlns:cx1="http://schemas.microsoft.com/office/drawing/2015/9/8/chartex" xmlns:cx2="http://schemas.microsoft.com/office/drawing/2015/10/21/chartex" xmlns:cx3="http://schemas.microsoft.com/office/drawing/2016/5/9/chartex" xmlns:cx4="http://schemas.microsoft.com/office/drawing/2016/5/10/chartex" xmlns:cx5="http://schemas.microsoft.com/office/drawing/2016/5/11/chartex" xmlns:cx6="http://schemas.microsoft.com/office/drawing/2016/5/12/chartex" xmlns:cx7="http://schemas.microsoft.com/office/drawing/2016/5/13/chartex" xmlns:cx8="http://schemas.microsoft.com/office/drawing/2016/5/14/chartex" xmlns:mc="http://schemas.openxmlformats.org/markup-compatibility/2006" xmlns:aink="http://schemas.microsoft.com/office/drawing/2016/ink" xmlns:am3d="http://schemas.microsoft.com/office/drawing/2017/model3d" xmlns:o="urn:schemas-microsoft-com:office:office" xmlns:oel="http://schemas.microsoft.com/office/2019/extlst" xmlns:r="http://schemas.openxmlformats.org/officeDocument/2006/relationships" xmlns:m="http://schemas.openxmlformats.org/officeDocument/2006/math" xmlns:v="urn:schemas-microsoft-com:vml" xmlns:wp14="http://schemas.microsoft.com/office/word/2010/wordprocessingDrawing" xmlns:wp="http://schemas.openxmlformats.org/drawingml/2006/wordprocessingDrawing" xmlns:w10="urn:schemas-microsoft-com:office:word" xmlns:w="http://schemas.openxmlformats.org/wordprocessingml/2006/main" xmlns:w14="http://schemas.microsoft.com/office/word/2010/wordml" xmlns:w15="http://schemas.microsoft.com/office/word/2012/wordml" xmlns:w16cex="http://schemas.microsoft.com/office/word/2018/wordml/cex" xmlns:w16cid="http://schemas.microsoft.com/office/word/2016/wordml/cid" xmlns:w16="http://schemas.microsoft.com/office/word/2018/wordml" xmlns:w16du="http://schemas.microsoft.com/office/word/2023/wordml/word16du" xmlns:w16sdtdh="http://schemas.microsoft.com/office/word/2020/wordml/sdtdatahash" xmlns:w16se="http://schemas.microsoft.com/office/word/2015/wordml/symex" xmlns:wpg="http://schemas.microsoft.com/office/word/2010/wordprocessingGroup" xmlns:wpi="http://schemas.microsoft.com/office/word/2010/wordprocessingInk" xmlns:wne="http://schemas.microsoft.com/office/word/2006/wordml" xmlns:wps="http://schemas.microsoft.com/office/word/2010/wordprocessingShape" mc:Ignorable="w14 w15 w16se w16cid w16 w16cex w16sdtdh wp14">
+<w:footnotes xmlns:wpc="http://schemas.microsoft.com/office/word/2010/wordprocessingCanvas" xmlns:cx="http://schemas.microsoft.com/office/drawing/2014/chartex" xmlns:cx1="http://schemas.microsoft.com/office/drawing/2015/9/8/chartex" xmlns:cx2="http://schemas.microsoft.com/office/drawing/2015/10/21/chartex" xmlns:cx3="http://schemas.microsoft.com/office/drawing/2016/5/9/chartex" xmlns:cx4="http://schemas.microsoft.com/office/drawing/2016/5/10/chartex" xmlns:cx5="http://schemas.microsoft.com/office/drawing/2016/5/11/chartex" xmlns:cx6="http://schemas.microsoft.com/office/drawing/2016/5/12/chartex" xmlns:cx7="http://schemas.microsoft.com/office/drawing/2016/5/13/chartex" xmlns:cx8="http://schemas.microsoft.com/office/drawing/2016/5/14/chartex" xmlns:mc="http://schemas.openxmlformats.org/markup-compatibility/2006" xmlns:aink="http://schemas.microsoft.com/office/drawing/2016/ink" xmlns:am3d="http://schemas.microsoft.com/office/drawing/2017/model3d" xmlns:o="urn:schemas-microsoft-com:office:office" xmlns:oel="http://schemas.microsoft.com/office/2019/extlst" xmlns:r="http://schemas.openxmlformats.org/officeDocument/2006/relationships" xmlns:m="http://schemas.openxmlformats.org/officeDocument/2006/math" xmlns:v="urn:schemas-microsoft-com:vml" xmlns:wp14="http://schemas.microsoft.com/office/word/2010/wordprocessingDrawing" xmlns:wp="http://schemas.openxmlformats.org/drawingml/2006/wordprocessingDrawing" xmlns:w10="urn:schemas-microsoft-com:office:word" xmlns:w="http://schemas.openxmlformats.org/wordprocessingml/2006/main" xmlns:w14="http://schemas.microsoft.com/office/word/2010/wordml" xmlns:w15="http://schemas.microsoft.com/office/word/2012/wordml" xmlns:w16cex="http://schemas.microsoft.com/office/word/2018/wordml/cex" xmlns:w16cid="http://schemas.microsoft.com/office/word/2016/wordml/cid" xmlns:w16="http://schemas.microsoft.com/office/word/2018/wordml" xmlns:w16sdtdh="http://schemas.microsoft.com/office/word/2020/wordml/sdtdatahash" xmlns:w16se="http://schemas.microsoft.com/office/word/2015/wordml/symex" xmlns:wpg="http://schemas.microsoft.com/office/word/2010/wordprocessingGroup" xmlns:wpi="http://schemas.microsoft.com/office/word/2010/wordprocessingInk" xmlns:wne="http://schemas.microsoft.com/office/word/2006/wordml" xmlns:wps="http://schemas.microsoft.com/office/word/2010/wordprocessingShape" mc:Ignorable="w14 w15 w16se w16cid w16 w16cex w16sdtdh wp14">
   <w:footnote w:type="separator" w:id="-1">
     <w:p>
       <w:pPr>
@@ -3773,7 +3617,7 @@
 </file>
 
 <file path=word/header1.xml><?xml version="1.0" encoding="utf-8"?>
-<w:hdr xmlns:wpc="http://schemas.microsoft.com/office/word/2010/wordprocessingCanvas" xmlns:cx="http://schemas.microsoft.com/office/drawing/2014/chartex" xmlns:cx1="http://schemas.microsoft.com/office/drawing/2015/9/8/chartex" xmlns:cx2="http://schemas.microsoft.com/office/drawing/2015/10/21/chartex" xmlns:cx3="http://schemas.microsoft.com/office/drawing/2016/5/9/chartex" xmlns:cx4="http://schemas.microsoft.com/office/drawing/2016/5/10/chartex" xmlns:cx5="http://schemas.microsoft.com/office/drawing/2016/5/11/chartex" xmlns:cx6="http://schemas.microsoft.com/office/drawing/2016/5/12/chartex" xmlns:cx7="http://schemas.microsoft.com/office/drawing/2016/5/13/chartex" xmlns:cx8="http://schemas.microsoft.com/office/drawing/2016/5/14/chartex" xmlns:mc="http://schemas.openxmlformats.org/markup-compatibility/2006" xmlns:aink="http://schemas.microsoft.com/office/drawing/2016/ink" xmlns:am3d="http://schemas.microsoft.com/office/drawing/2017/model3d" xmlns:o="urn:schemas-microsoft-com:office:office" xmlns:oel="http://schemas.microsoft.com/office/2019/extlst" xmlns:r="http://schemas.openxmlformats.org/officeDocument/2006/relationships" xmlns:m="http://schemas.openxmlformats.org/officeDocument/2006/math" xmlns:v="urn:schemas-microsoft-com:vml" xmlns:wp14="http://schemas.microsoft.com/office/word/2010/wordprocessingDrawing" xmlns:wp="http://schemas.openxmlformats.org/drawingml/2006/wordprocessingDrawing" xmlns:w10="urn:schemas-microsoft-com:office:word" xmlns:w="http://schemas.openxmlformats.org/wordprocessingml/2006/main" xmlns:w14="http://schemas.microsoft.com/office/word/2010/wordml" xmlns:w15="http://schemas.microsoft.com/office/word/2012/wordml" xmlns:w16cex="http://schemas.microsoft.com/office/word/2018/wordml/cex" xmlns:w16cid="http://schemas.microsoft.com/office/word/2016/wordml/cid" xmlns:w16="http://schemas.microsoft.com/office/word/2018/wordml" xmlns:w16du="http://schemas.microsoft.com/office/word/2023/wordml/word16du" xmlns:w16sdtdh="http://schemas.microsoft.com/office/word/2020/wordml/sdtdatahash" xmlns:w16se="http://schemas.microsoft.com/office/word/2015/wordml/symex" xmlns:wpg="http://schemas.microsoft.com/office/word/2010/wordprocessingGroup" xmlns:wpi="http://schemas.microsoft.com/office/word/2010/wordprocessingInk" xmlns:wne="http://schemas.microsoft.com/office/word/2006/wordml" xmlns:wps="http://schemas.microsoft.com/office/word/2010/wordprocessingShape" mc:Ignorable="w14 w15 w16se w16cid w16 w16cex w16sdtdh wp14">
+<w:hdr xmlns:wpc="http://schemas.microsoft.com/office/word/2010/wordprocessingCanvas" xmlns:cx="http://schemas.microsoft.com/office/drawing/2014/chartex" xmlns:cx1="http://schemas.microsoft.com/office/drawing/2015/9/8/chartex" xmlns:cx2="http://schemas.microsoft.com/office/drawing/2015/10/21/chartex" xmlns:cx3="http://schemas.microsoft.com/office/drawing/2016/5/9/chartex" xmlns:cx4="http://schemas.microsoft.com/office/drawing/2016/5/10/chartex" xmlns:cx5="http://schemas.microsoft.com/office/drawing/2016/5/11/chartex" xmlns:cx6="http://schemas.microsoft.com/office/drawing/2016/5/12/chartex" xmlns:cx7="http://schemas.microsoft.com/office/drawing/2016/5/13/chartex" xmlns:cx8="http://schemas.microsoft.com/office/drawing/2016/5/14/chartex" xmlns:mc="http://schemas.openxmlformats.org/markup-compatibility/2006" xmlns:aink="http://schemas.microsoft.com/office/drawing/2016/ink" xmlns:am3d="http://schemas.microsoft.com/office/drawing/2017/model3d" xmlns:o="urn:schemas-microsoft-com:office:office" xmlns:oel="http://schemas.microsoft.com/office/2019/extlst" xmlns:r="http://schemas.openxmlformats.org/officeDocument/2006/relationships" xmlns:m="http://schemas.openxmlformats.org/officeDocument/2006/math" xmlns:v="urn:schemas-microsoft-com:vml" xmlns:wp14="http://schemas.microsoft.com/office/word/2010/wordprocessingDrawing" xmlns:wp="http://schemas.openxmlformats.org/drawingml/2006/wordprocessingDrawing" xmlns:w10="urn:schemas-microsoft-com:office:word" xmlns:w="http://schemas.openxmlformats.org/wordprocessingml/2006/main" xmlns:w14="http://schemas.microsoft.com/office/word/2010/wordml" xmlns:w15="http://schemas.microsoft.com/office/word/2012/wordml" xmlns:w16cex="http://schemas.microsoft.com/office/word/2018/wordml/cex" xmlns:w16cid="http://schemas.microsoft.com/office/word/2016/wordml/cid" xmlns:w16="http://schemas.microsoft.com/office/word/2018/wordml" xmlns:w16sdtdh="http://schemas.microsoft.com/office/word/2020/wordml/sdtdatahash" xmlns:w16se="http://schemas.microsoft.com/office/word/2015/wordml/symex" xmlns:wpg="http://schemas.microsoft.com/office/word/2010/wordprocessingGroup" xmlns:wpi="http://schemas.microsoft.com/office/word/2010/wordprocessingInk" xmlns:wne="http://schemas.microsoft.com/office/word/2006/wordml" xmlns:wps="http://schemas.microsoft.com/office/word/2010/wordprocessingShape" mc:Ignorable="w14 w15 w16se w16cid w16 w16cex w16sdtdh wp14">
   <w:p>
     <w:pPr>
       <w:pStyle w:val="Kopfzeile"/>
@@ -3910,7 +3754,7 @@
 </file>
 
 <file path=word/numbering.xml><?xml version="1.0" encoding="utf-8"?>
-<w:numbering xmlns:wpc="http://schemas.microsoft.com/office/word/2010/wordprocessingCanvas" xmlns:cx="http://schemas.microsoft.com/office/drawing/2014/chartex" xmlns:cx1="http://schemas.microsoft.com/office/drawing/2015/9/8/chartex" xmlns:cx2="http://schemas.microsoft.com/office/drawing/2015/10/21/chartex" xmlns:cx3="http://schemas.microsoft.com/office/drawing/2016/5/9/chartex" xmlns:cx4="http://schemas.microsoft.com/office/drawing/2016/5/10/chartex" xmlns:cx5="http://schemas.microsoft.com/office/drawing/2016/5/11/chartex" xmlns:cx6="http://schemas.microsoft.com/office/drawing/2016/5/12/chartex" xmlns:cx7="http://schemas.microsoft.com/office/drawing/2016/5/13/chartex" xmlns:cx8="http://schemas.microsoft.com/office/drawing/2016/5/14/chartex" xmlns:mc="http://schemas.openxmlformats.org/markup-compatibility/2006" xmlns:aink="http://schemas.microsoft.com/office/drawing/2016/ink" xmlns:am3d="http://schemas.microsoft.com/office/drawing/2017/model3d" xmlns:o="urn:schemas-microsoft-com:office:office" xmlns:oel="http://schemas.microsoft.com/office/2019/extlst" xmlns:r="http://schemas.openxmlformats.org/officeDocument/2006/relationships" xmlns:m="http://schemas.openxmlformats.org/officeDocument/2006/math" xmlns:v="urn:schemas-microsoft-com:vml" xmlns:wp14="http://schemas.microsoft.com/office/word/2010/wordprocessingDrawing" xmlns:wp="http://schemas.openxmlformats.org/drawingml/2006/wordprocessingDrawing" xmlns:w10="urn:schemas-microsoft-com:office:word" xmlns:w="http://schemas.openxmlformats.org/wordprocessingml/2006/main" xmlns:w14="http://schemas.microsoft.com/office/word/2010/wordml" xmlns:w15="http://schemas.microsoft.com/office/word/2012/wordml" xmlns:w16cex="http://schemas.microsoft.com/office/word/2018/wordml/cex" xmlns:w16cid="http://schemas.microsoft.com/office/word/2016/wordml/cid" xmlns:w16="http://schemas.microsoft.com/office/word/2018/wordml" xmlns:w16du="http://schemas.microsoft.com/office/word/2023/wordml/word16du" xmlns:w16sdtdh="http://schemas.microsoft.com/office/word/2020/wordml/sdtdatahash" xmlns:w16se="http://schemas.microsoft.com/office/word/2015/wordml/symex" xmlns:wpg="http://schemas.microsoft.com/office/word/2010/wordprocessingGroup" xmlns:wpi="http://schemas.microsoft.com/office/word/2010/wordprocessingInk" xmlns:wne="http://schemas.microsoft.com/office/word/2006/wordml" xmlns:wps="http://schemas.microsoft.com/office/word/2010/wordprocessingShape" mc:Ignorable="w14 w15 w16se w16cid w16 w16cex w16sdtdh wp14">
+<w:numbering xmlns:wpc="http://schemas.microsoft.com/office/word/2010/wordprocessingCanvas" xmlns:cx="http://schemas.microsoft.com/office/drawing/2014/chartex" xmlns:cx1="http://schemas.microsoft.com/office/drawing/2015/9/8/chartex" xmlns:cx2="http://schemas.microsoft.com/office/drawing/2015/10/21/chartex" xmlns:cx3="http://schemas.microsoft.com/office/drawing/2016/5/9/chartex" xmlns:cx4="http://schemas.microsoft.com/office/drawing/2016/5/10/chartex" xmlns:cx5="http://schemas.microsoft.com/office/drawing/2016/5/11/chartex" xmlns:cx6="http://schemas.microsoft.com/office/drawing/2016/5/12/chartex" xmlns:cx7="http://schemas.microsoft.com/office/drawing/2016/5/13/chartex" xmlns:cx8="http://schemas.microsoft.com/office/drawing/2016/5/14/chartex" xmlns:mc="http://schemas.openxmlformats.org/markup-compatibility/2006" xmlns:aink="http://schemas.microsoft.com/office/drawing/2016/ink" xmlns:am3d="http://schemas.microsoft.com/office/drawing/2017/model3d" xmlns:o="urn:schemas-microsoft-com:office:office" xmlns:oel="http://schemas.microsoft.com/office/2019/extlst" xmlns:r="http://schemas.openxmlformats.org/officeDocument/2006/relationships" xmlns:m="http://schemas.openxmlformats.org/officeDocument/2006/math" xmlns:v="urn:schemas-microsoft-com:vml" xmlns:wp14="http://schemas.microsoft.com/office/word/2010/wordprocessingDrawing" xmlns:wp="http://schemas.openxmlformats.org/drawingml/2006/wordprocessingDrawing" xmlns:w10="urn:schemas-microsoft-com:office:word" xmlns:w="http://schemas.openxmlformats.org/wordprocessingml/2006/main" xmlns:w14="http://schemas.microsoft.com/office/word/2010/wordml" xmlns:w15="http://schemas.microsoft.com/office/word/2012/wordml" xmlns:w16cex="http://schemas.microsoft.com/office/word/2018/wordml/cex" xmlns:w16cid="http://schemas.microsoft.com/office/word/2016/wordml/cid" xmlns:w16="http://schemas.microsoft.com/office/word/2018/wordml" xmlns:w16sdtdh="http://schemas.microsoft.com/office/word/2020/wordml/sdtdatahash" xmlns:w16se="http://schemas.microsoft.com/office/word/2015/wordml/symex" xmlns:wpg="http://schemas.microsoft.com/office/word/2010/wordprocessingGroup" xmlns:wpi="http://schemas.microsoft.com/office/word/2010/wordprocessingInk" xmlns:wne="http://schemas.microsoft.com/office/word/2006/wordml" xmlns:wps="http://schemas.microsoft.com/office/word/2010/wordprocessingShape" mc:Ignorable="w14 w15 w16se w16cid w16 w16cex w16sdtdh wp14">
   <w:abstractNum w:abstractNumId="0" w15:restartNumberingAfterBreak="0">
     <w:nsid w:val="0515202D"/>
     <w:multiLevelType w:val="hybridMultilevel"/>
@@ -6013,27 +5857,6 @@
 </file>
 
 <file path=customXml/item1.xml><?xml version="1.0" encoding="utf-8"?>
-<?mso-contentType ?>
-<FormTemplates xmlns="http://schemas.microsoft.com/sharepoint/v3/contenttype/forms">
-  <Display>DocumentLibraryForm</Display>
-  <Edit>DocumentLibraryForm</Edit>
-  <New>DocumentLibraryForm</New>
-</FormTemplates>
-</file>
-
-<file path=customXml/item2.xml><?xml version="1.0" encoding="utf-8"?>
-<p:properties xmlns:p="http://schemas.microsoft.com/office/2006/metadata/properties" xmlns:xsi="http://www.w3.org/2001/XMLSchema-instance" xmlns:pc="http://schemas.microsoft.com/office/infopath/2007/PartnerControls">
-  <documentManagement>
-    <_activity xmlns="84ce651a-e28d-4e68-81c1-12757b1bac30" xsi:nil="true"/>
-  </documentManagement>
-</p:properties>
-</file>
-
-<file path=customXml/item3.xml><?xml version="1.0" encoding="utf-8"?>
-<b:Sources xmlns:b="http://schemas.openxmlformats.org/officeDocument/2006/bibliography" xmlns="http://schemas.openxmlformats.org/officeDocument/2006/bibliography" SelectedStyle="\APASixthEditionOfficeOnline.xsl" StyleName="APA" Version="6"/>
-</file>
-
-<file path=customXml/item4.xml><?xml version="1.0" encoding="utf-8"?>
 <ct:contentTypeSchema xmlns:ct="http://schemas.microsoft.com/office/2006/metadata/contentType" xmlns:ma="http://schemas.microsoft.com/office/2006/metadata/properties/metaAttributes" ct:_="" ma:_="" ma:contentTypeName="Dokument" ma:contentTypeID="0x010100A38337EFE7BE7B409AF79633F7BE1B5F" ma:contentTypeVersion="12" ma:contentTypeDescription="Ein neues Dokument erstellen." ma:contentTypeScope="" ma:versionID="af509a0b8f6ef6dc1d88cb8f0e71fd31">
   <xsd:schema xmlns:xsd="http://www.w3.org/2001/XMLSchema" xmlns:xs="http://www.w3.org/2001/XMLSchema" xmlns:p="http://schemas.microsoft.com/office/2006/metadata/properties" xmlns:ns3="84ce651a-e28d-4e68-81c1-12757b1bac30" xmlns:ns4="1c55c1ce-ac50-4f3d-aa3c-6a9cfeeda7a4" targetNamespace="http://schemas.microsoft.com/office/2006/metadata/properties" ma:root="true" ma:fieldsID="72ee5615be5b539f53693c2d80c4b717" ns3:_="" ns4:_="">
     <xsd:import namespace="84ce651a-e28d-4e68-81c1-12757b1bac30"/>
@@ -6250,33 +6073,28 @@
 </ct:contentTypeSchema>
 </file>
 
-<file path=customXml/itemProps1.xml><?xml version="1.0" encoding="utf-8"?>
-<ds:datastoreItem xmlns:ds="http://schemas.openxmlformats.org/officeDocument/2006/customXml" ds:itemID="{C4D5DEE7-EC10-4B68-8EF6-4E054E99DDA0}">
-  <ds:schemaRefs>
-    <ds:schemaRef ds:uri="http://schemas.microsoft.com/sharepoint/v3/contenttype/forms"/>
-  </ds:schemaRefs>
-</ds:datastoreItem>
+<file path=customXml/item2.xml><?xml version="1.0" encoding="utf-8"?>
+<b:Sources xmlns:b="http://schemas.openxmlformats.org/officeDocument/2006/bibliography" xmlns="http://schemas.openxmlformats.org/officeDocument/2006/bibliography" SelectedStyle="\APASixthEditionOfficeOnline.xsl" StyleName="APA" Version="6"/>
 </file>
 
-<file path=customXml/itemProps2.xml><?xml version="1.0" encoding="utf-8"?>
-<ds:datastoreItem xmlns:ds="http://schemas.openxmlformats.org/officeDocument/2006/customXml" ds:itemID="{EF19AF65-F834-4899-8769-D9C53809A992}">
-  <ds:schemaRefs>
-    <ds:schemaRef ds:uri="http://schemas.microsoft.com/office/2006/metadata/properties"/>
-    <ds:schemaRef ds:uri="http://schemas.microsoft.com/office/infopath/2007/PartnerControls"/>
-    <ds:schemaRef ds:uri="84ce651a-e28d-4e68-81c1-12757b1bac30"/>
-  </ds:schemaRefs>
-</ds:datastoreItem>
+<file path=customXml/item3.xml><?xml version="1.0" encoding="utf-8"?>
+<p:properties xmlns:p="http://schemas.microsoft.com/office/2006/metadata/properties" xmlns:xsi="http://www.w3.org/2001/XMLSchema-instance" xmlns:pc="http://schemas.microsoft.com/office/infopath/2007/PartnerControls">
+  <documentManagement>
+    <_activity xmlns="84ce651a-e28d-4e68-81c1-12757b1bac30" xsi:nil="true"/>
+  </documentManagement>
+</p:properties>
 </file>
 
-<file path=customXml/itemProps3.xml><?xml version="1.0" encoding="utf-8"?>
-<ds:datastoreItem xmlns:ds="http://schemas.openxmlformats.org/officeDocument/2006/customXml" ds:itemID="{060E8326-3A22-422D-B313-C499E2E8EEA7}">
-  <ds:schemaRefs>
-    <ds:schemaRef ds:uri="http://schemas.openxmlformats.org/officeDocument/2006/bibliography"/>
-  </ds:schemaRefs>
-</ds:datastoreItem>
+<file path=customXml/item4.xml><?xml version="1.0" encoding="utf-8"?>
+<?mso-contentType ?>
+<FormTemplates xmlns="http://schemas.microsoft.com/sharepoint/v3/contenttype/forms">
+  <Display>DocumentLibraryForm</Display>
+  <Edit>DocumentLibraryForm</Edit>
+  <New>DocumentLibraryForm</New>
+</FormTemplates>
 </file>
 
-<file path=customXml/itemProps4.xml><?xml version="1.0" encoding="utf-8"?>
+<file path=customXml/itemProps1.xml><?xml version="1.0" encoding="utf-8"?>
 <ds:datastoreItem xmlns:ds="http://schemas.openxmlformats.org/officeDocument/2006/customXml" ds:itemID="{44D8C1AE-B5FF-47BE-9DE3-126F3CD3D4AB}">
   <ds:schemaRefs>
     <ds:schemaRef ds:uri="http://schemas.microsoft.com/office/2006/metadata/contentType"/>
@@ -6293,4 +6111,30 @@
     <ds:schemaRef ds:uri="http://schemas.microsoft.com/internal/obd"/>
   </ds:schemaRefs>
 </ds:datastoreItem>
+</file>
+
+<file path=customXml/itemProps2.xml><?xml version="1.0" encoding="utf-8"?>
+<ds:datastoreItem xmlns:ds="http://schemas.openxmlformats.org/officeDocument/2006/customXml" ds:itemID="{060E8326-3A22-422D-B313-C499E2E8EEA7}">
+  <ds:schemaRefs>
+    <ds:schemaRef ds:uri="http://schemas.openxmlformats.org/officeDocument/2006/bibliography"/>
+  </ds:schemaRefs>
+</ds:datastoreItem>
+</file>
+
+<file path=customXml/itemProps3.xml><?xml version="1.0" encoding="utf-8"?>
+<ds:datastoreItem xmlns:ds="http://schemas.openxmlformats.org/officeDocument/2006/customXml" ds:itemID="{EF19AF65-F834-4899-8769-D9C53809A992}">
+  <ds:schemaRefs>
+    <ds:schemaRef ds:uri="http://schemas.microsoft.com/office/2006/metadata/properties"/>
+    <ds:schemaRef ds:uri="http://schemas.microsoft.com/office/infopath/2007/PartnerControls"/>
+    <ds:schemaRef ds:uri="84ce651a-e28d-4e68-81c1-12757b1bac30"/>
+  </ds:schemaRefs>
+</ds:datastoreItem>
+</file>
+
+<file path=customXml/itemProps4.xml><?xml version="1.0" encoding="utf-8"?>
+<ds:datastoreItem xmlns:ds="http://schemas.openxmlformats.org/officeDocument/2006/customXml" ds:itemID="{C4D5DEE7-EC10-4B68-8EF6-4E054E99DDA0}">
+  <ds:schemaRefs>
+    <ds:schemaRef ds:uri="http://schemas.microsoft.com/sharepoint/v3/contenttype/forms"/>
+  </ds:schemaRefs>
+</ds:datastoreItem>
 </file>
</xml_diff>